<commit_message>
update the vison, architecture of fdlang
</commit_message>
<xml_diff>
--- a/docs/BaoCao.docx
+++ b/docs/BaoCao.docx
@@ -254,6 +254,15 @@
     </w:p>
     <w:sdt>
       <w:sdtPr>
+        <w:rPr>
+          <w:rFonts w:ascii="Times New Roman" w:eastAsiaTheme="minorHAnsi" w:hAnsi="Times New Roman" w:cstheme="minorBidi"/>
+          <w:color w:val="auto"/>
+          <w:kern w:val="2"/>
+          <w:sz w:val="28"/>
+          <w:szCs w:val="22"/>
+          <w:lang w:eastAsia="en-US"/>
+          <w14:ligatures w14:val="standardContextual"/>
+        </w:rPr>
         <w:id w:val="-1715646225"/>
         <w:docPartObj>
           <w:docPartGallery w:val="Table of Contents"/>
@@ -262,15 +271,8 @@
       </w:sdtPr>
       <w:sdtEndPr>
         <w:rPr>
-          <w:rFonts w:ascii="Times New Roman" w:eastAsiaTheme="minorHAnsi" w:hAnsi="Times New Roman" w:cstheme="minorBidi"/>
           <w:b/>
           <w:bCs/>
-          <w:color w:val="auto"/>
-          <w:kern w:val="2"/>
-          <w:sz w:val="28"/>
-          <w:szCs w:val="22"/>
-          <w:lang w:eastAsia="en-US"/>
-          <w14:ligatures w14:val="standardContextual"/>
         </w:rPr>
       </w:sdtEndPr>
       <w:sdtContent>
@@ -517,9 +519,6 @@
     <w:p>
       <w:pPr>
         <w:pStyle w:val="u2"/>
-        <w:rPr>
-          <w:lang w:val="en-US"/>
-        </w:rPr>
       </w:pPr>
       <w:r>
         <w:t>1.2. Mục tiêu nghiên cứu</w:t>
@@ -527,9 +526,6 @@
     </w:p>
     <w:p>
       <w:r>
-        <w:rPr>
-          <w:lang w:val="en-US"/>
-        </w:rPr>
         <w:t>+</w:t>
       </w:r>
       <w:r>
@@ -548,10 +544,7 @@
     </w:p>
     <w:p>
       <w:r>
-        <w:t>+</w:t>
-      </w:r>
-      <w:r>
-        <w:t xml:space="preserve">  </w:t>
+        <w:t xml:space="preserve">+  </w:t>
       </w:r>
       <w:r>
         <w:rPr>
@@ -563,48 +556,25 @@
     </w:p>
     <w:p>
       <w:r>
-        <w:t xml:space="preserve"> - </w:t>
-      </w:r>
-      <w:r>
-        <w:t>Xây dựng bộ quét từ vựng (Lexer) theo cơ chế "Pull-based" và "Zero-allocation" để xử lý hàng triệu token mà không gây quá tải RAM.</w:t>
-      </w:r>
-    </w:p>
-    <w:p>
-      <w:r>
-        <w:t xml:space="preserve"> - </w:t>
-      </w:r>
-      <w:r>
-        <w:t>Thiết kế bộ phân tích cú pháp (Parser) dựa trên ngữ pháp đã định nghĩa, đảm bảo tính chặt chẽ.</w:t>
-      </w:r>
-    </w:p>
-    <w:p>
-      <w:r>
-        <w:t xml:space="preserve"> - </w:t>
-      </w:r>
-      <w:r>
-        <w:t>Tích hợp sâu với LLVM để biên dịch mã nguồn fdlang thành mã máy (Machine Code) tối ưu.</w:t>
-      </w:r>
-    </w:p>
-    <w:p>
-      <w:pPr>
-        <w:rPr>
-          <w:lang w:val="en-US"/>
-        </w:rPr>
-      </w:pPr>
-      <w:r>
-        <w:t xml:space="preserve"> - </w:t>
-      </w:r>
-      <w:r>
-        <w:t>Thiết lập quy trình xây dựng dự án bằng CMake, giải quyết các xung đột thư viện và cấu hình hệ thống trên môi trường Windows (MSVC).</w:t>
-      </w:r>
-    </w:p>
-    <w:p>
-      <w:pPr>
-        <w:rPr>
-          <w:lang w:val="en-US"/>
-        </w:rPr>
-      </w:pPr>
-    </w:p>
+        <w:t xml:space="preserve"> - Xây dựng bộ quét từ vựng (Lexer) theo cơ chế "Pull-based" và "Zero-allocation" để xử lý hàng triệu token mà không gây quá tải RAM.</w:t>
+      </w:r>
+    </w:p>
+    <w:p>
+      <w:r>
+        <w:t xml:space="preserve"> - Thiết kế bộ phân tích cú pháp (Parser) dựa trên ngữ pháp đã định nghĩa, đảm bảo tính chặt chẽ.</w:t>
+      </w:r>
+    </w:p>
+    <w:p>
+      <w:r>
+        <w:t xml:space="preserve"> - Tích hợp sâu với LLVM để biên dịch mã nguồn fdlang thành mã máy (Machine Code) tối ưu.</w:t>
+      </w:r>
+    </w:p>
+    <w:p>
+      <w:r>
+        <w:t xml:space="preserve"> - Thiết lập quy trình xây dựng dự án bằng CMake, giải quyết các xung đột thư viện và cấu hình hệ thống trên môi trường Windows (MSVC).</w:t>
+      </w:r>
+    </w:p>
+    <w:p/>
     <w:p>
       <w:pPr>
         <w:pStyle w:val="u2"/>
@@ -649,10 +619,7 @@
         <w:ind w:left="720"/>
       </w:pPr>
       <w:r>
-        <w:t xml:space="preserve">+ </w:t>
-      </w:r>
-      <w:r>
-        <w:t>Xây dựng code theo hướng "Literate Programming" – viết tài liệu trước, hiện thực hóa mã nguồn sau để đảm bảo logic xuyên suốt.</w:t>
+        <w:t>+ Xây dựng code theo hướng "Literate Programming" – viết tài liệu trước, hiện thực hóa mã nguồn sau để đảm bảo logic xuyên suốt.</w:t>
       </w:r>
     </w:p>
     <w:p>
@@ -660,10 +627,7 @@
         <w:ind w:left="720"/>
       </w:pPr>
       <w:r>
-        <w:t xml:space="preserve">+ </w:t>
-      </w:r>
-      <w:r>
-        <w:t>Thực hiện các bước build, debug, xử lý lỗi liên kết (Linker errors), và tối ưu hóa hiệu năng trên thực tế.</w:t>
+        <w:t>+ Thực hiện các bước build, debug, xử lý lỗi liên kết (Linker errors), và tối ưu hóa hiệu năng trên thực tế.</w:t>
       </w:r>
     </w:p>
     <w:p>
@@ -693,27 +657,18 @@
     <w:p>
       <w:pPr>
         <w:pStyle w:val="u1"/>
-        <w:rPr>
-          <w:lang w:val="en-US"/>
-        </w:rPr>
       </w:pPr>
       <w:r>
         <w:lastRenderedPageBreak/>
         <w:t xml:space="preserve">CHƯƠNG II. </w:t>
       </w:r>
       <w:r>
-        <w:rPr>
-          <w:lang w:val="en-US"/>
-        </w:rPr>
         <w:t>KIẾN THỨC NỀN TẢNG, KIẾN TRÚC NGÔN NGỮ</w:t>
       </w:r>
     </w:p>
     <w:p>
       <w:pPr>
         <w:pStyle w:val="u2"/>
-        <w:rPr>
-          <w:lang w:val="en-US"/>
-        </w:rPr>
       </w:pPr>
       <w:r>
         <w:t>2.1. Tổng quan về trình biên dịch (Compiler)</w:t>
@@ -733,222 +688,239 @@
           <w:b/>
           <w:bCs/>
         </w:rPr>
-        <w:t xml:space="preserve">- </w:t>
-      </w:r>
+        <w:t>- Frontend (Giai đoạn phân tích):</w:t>
+      </w:r>
+      <w:r>
+        <w:t xml:space="preserve"> Chịu trách nhiệm quét từ vựng (Lexing), phân tích cú pháp (Parsing) và kiểm tra ngữ nghĩa (Semantic Analysis) để tạo ra cây cú pháp trừu tượng (AST) hoặc biểu diễn trung gian. Đây là giai đoạn mà fdlang tập trung tối ưu hóa hiệu năng.</w:t>
+      </w:r>
+    </w:p>
+    <w:p>
+      <w:pPr>
+        <w:ind w:firstLine="360"/>
+      </w:pPr>
       <w:r>
         <w:rPr>
           <w:b/>
           <w:bCs/>
-        </w:rPr>
-        <w:t>Frontend (Giai đoạn phân tích):</w:t>
-      </w:r>
-      <w:r>
-        <w:t xml:space="preserve"> Chịu trách nhiệm quét từ vựng (Lexing), phân tích cú pháp (Parsing) và kiểm tra ngữ nghĩa (Semantic Analysis) để tạo ra cây cú pháp trừu tượng (AST) hoặc biểu diễn trung gian. Đây là giai đoạn mà fdlang tập trung tối ưu hóa hiệu năng.</w:t>
-      </w:r>
-    </w:p>
-    <w:p>
-      <w:pPr>
-        <w:ind w:firstLine="360"/>
-      </w:pPr>
+          <w:lang w:val="en-US"/>
+        </w:rPr>
+        <w:t xml:space="preserve">- </w:t>
+      </w:r>
       <w:r>
         <w:rPr>
           <w:b/>
           <w:bCs/>
-          <w:lang w:val="en-US"/>
-        </w:rPr>
-        <w:t xml:space="preserve">- </w:t>
-      </w:r>
+        </w:rPr>
+        <w:t>Middleware (Giai đoạn chuyển đổi):</w:t>
+      </w:r>
+      <w:r>
+        <w:t xml:space="preserve"> Thực hiện tối ưu hóa trên ngôn ngữ trung gian (Intermediate Representation - IR). Tại đây, fdlang sử dụng LLVM IR – một chuẩn công nghiệp giúp tách biệt việc thiết kế ngôn ngữ với việc sinh mã máy cho từng loại chip (x86, ARM, RISC-V).</w:t>
+      </w:r>
+    </w:p>
+    <w:p>
+      <w:pPr>
+        <w:ind w:firstLine="360"/>
+      </w:pPr>
       <w:r>
         <w:rPr>
           <w:b/>
           <w:bCs/>
         </w:rPr>
-        <w:t>Middleware (Giai đoạn chuyển đổi):</w:t>
-      </w:r>
-      <w:r>
-        <w:t xml:space="preserve"> Thực hiện tối ưu hóa trên ngôn ngữ trung gian (Intermediate Representation - IR). Tại đây, fdlang sử dụng LLVM IR – một chuẩn công nghiệp giúp tách biệt việc thiết kế ngôn ngữ với việc sinh mã máy cho từng loại chip (x86, ARM, RISC-V).</w:t>
-      </w:r>
-    </w:p>
-    <w:p>
-      <w:pPr>
-        <w:ind w:firstLine="360"/>
+        <w:t>- Backend (Giai đoạn sinh mã):</w:t>
+      </w:r>
+      <w:r>
+        <w:t xml:space="preserve"> Chuyển đổi IR đã tối ưu hóa thành mã máy cụ thể cho hệ điều hành và kiến trúc phần cứng đích.</w:t>
+      </w:r>
+    </w:p>
+    <w:p/>
+    <w:p>
+      <w:pPr>
+        <w:pStyle w:val="u2"/>
+      </w:pPr>
+      <w:r>
+        <w:t>2.2. Đặc tả ngôn ngữ FDlang (Cú pháp, từ vựng, ngữ nghĩa)</w:t>
+      </w:r>
+    </w:p>
+    <w:p>
+      <w:r>
+        <w:t>fdlang được thiết kế theo hướng ngôn ngữ lập trình hệ thống, tập trung vào hiệu năng thực thi và tối ưu hóa bộ nhớ ngay từ khâu phân tích từ vựng.</w:t>
+      </w:r>
+    </w:p>
+    <w:p>
+      <w:pPr>
+        <w:ind w:left="720"/>
       </w:pPr>
       <w:r>
         <w:rPr>
           <w:b/>
           <w:bCs/>
         </w:rPr>
-        <w:t xml:space="preserve">- </w:t>
+        <w:t>- Từ vựng (Lexical Specification):</w:t>
+      </w:r>
+    </w:p>
+    <w:p>
+      <w:pPr>
+        <w:ind w:left="1440"/>
+      </w:pPr>
+      <w:r>
+        <w:t xml:space="preserve">+ Cơ chế </w:t>
       </w:r>
       <w:r>
         <w:rPr>
           <w:b/>
           <w:bCs/>
         </w:rPr>
-        <w:t>Backend (Giai đoạn sinh mã):</w:t>
-      </w:r>
-      <w:r>
-        <w:t xml:space="preserve"> Chuyển đổi IR đã tối ưu hóa thành mã máy cụ thể cho hệ điều hành và kiến trúc phần cứng đích.</w:t>
-      </w:r>
-    </w:p>
-    <w:p/>
-    <w:p>
-      <w:pPr>
-        <w:pStyle w:val="u2"/>
-        <w:rPr>
-          <w:lang w:val="en-US"/>
-        </w:rPr>
-      </w:pPr>
-      <w:r>
-        <w:t>2.2. Đặc tả ngôn ngữ FDlang (Cú pháp, từ vựng, ngữ nghĩa)</w:t>
-      </w:r>
-    </w:p>
-    <w:p>
-      <w:r>
-        <w:t>fdlang được thiết kế theo hướng ngôn ngữ lập trình hệ thống, tập trung vào hiệu năng thực thi và tối ưu hóa bộ nhớ ngay từ khâu phân tích từ vựng.</w:t>
-      </w:r>
-    </w:p>
-    <w:p>
-      <w:pPr>
-        <w:ind w:left="720"/>
-      </w:pPr>
+        <w:t>"Pull-based Lexing"</w:t>
+      </w:r>
+      <w:r>
+        <w:t>: Lexer không nạp toàn bộ dữ liệu, chỉ phân tích khi được yêu cầu, giúp giảm thiểu tải RAM.</w:t>
+      </w:r>
+    </w:p>
+    <w:p>
+      <w:pPr>
+        <w:ind w:left="1440"/>
+      </w:pPr>
+      <w:r>
+        <w:t xml:space="preserve">+ Kỹ thuật </w:t>
+      </w:r>
       <w:r>
         <w:rPr>
           <w:b/>
           <w:bCs/>
         </w:rPr>
-        <w:t xml:space="preserve">- </w:t>
+        <w:t>"Zero-allocation"</w:t>
+      </w:r>
+      <w:r>
+        <w:t>: Thay vì cấp phát bộ nhớ mới cho mỗi từ vựng (Token), fdlang sử dụng std::string_view để trỏ trực tiếp vào vùng nhớ chứa mã nguồn gốc, giúp giảm chi phí sao chép dữ liệu về 0.</w:t>
+      </w:r>
+    </w:p>
+    <w:p>
+      <w:pPr>
+        <w:ind w:left="1440"/>
+      </w:pPr>
+      <w:r>
+        <w:t xml:space="preserve">+ Hệ thống </w:t>
       </w:r>
       <w:r>
         <w:rPr>
           <w:b/>
           <w:bCs/>
         </w:rPr>
-        <w:t>Từ vựng (Lexical Specification):</w:t>
-      </w:r>
-    </w:p>
-    <w:p>
-      <w:pPr>
-        <w:ind w:left="1440"/>
-      </w:pPr>
-      <w:r>
-        <w:t xml:space="preserve">+ </w:t>
-      </w:r>
-      <w:r>
-        <w:t xml:space="preserve">Cơ chế </w:t>
-      </w:r>
+        <w:t>"Span"</w:t>
+      </w:r>
+      <w:r>
+        <w:t>: Sử dụng kỹ thuật lưu trữ vị trí dạng byte offset (tương tự Rust) để tối ưu hóa kích thước Token, đảm bảo khả năng mở rộng khi phân tích dự án có hàng chục nghìn file mã nguồn.</w:t>
+      </w:r>
+    </w:p>
+    <w:p>
+      <w:pPr>
+        <w:ind w:left="720"/>
+      </w:pPr>
       <w:r>
         <w:rPr>
           <w:b/>
           <w:bCs/>
         </w:rPr>
-        <w:t>"Pull-based Lexing"</w:t>
-      </w:r>
-      <w:r>
-        <w:t>: Lexer không nạp toàn bộ dữ liệu, chỉ phân tích khi được yêu cầu, giúp giảm thiểu tải RAM.</w:t>
-      </w:r>
-    </w:p>
-    <w:p>
-      <w:pPr>
-        <w:ind w:left="1440"/>
-      </w:pPr>
-      <w:r>
-        <w:t xml:space="preserve">+ </w:t>
-      </w:r>
-      <w:r>
-        <w:t xml:space="preserve">Kỹ thuật </w:t>
-      </w:r>
+        <w:lastRenderedPageBreak/>
+        <w:t>- Cú pháp (Syntactic Specification):</w:t>
+      </w:r>
+      <w:r>
+        <w:t xml:space="preserve"> Cú pháp của fdlang được thiết kế hướng mục tiêu, hỗ trợ các cấu trúc khai báo biến (dec), điều khiển luồng (if, else) và module hóa (mod, export, extern), đảm bảo tính chặt chẽ và tường minh.</w:t>
+      </w:r>
+    </w:p>
+    <w:p>
+      <w:pPr>
+        <w:ind w:left="720"/>
+        <w:rPr>
+          <w:lang w:val="en-US"/>
+        </w:rPr>
+      </w:pPr>
       <w:r>
         <w:rPr>
           <w:b/>
           <w:bCs/>
         </w:rPr>
-        <w:t>"Zero-allocation"</w:t>
-      </w:r>
-      <w:r>
-        <w:t>: Thay vì cấp phát bộ nhớ mới cho mỗi từ vựng (Token), fdlang sử dụng std::string_view để trỏ trực tiếp vào vùng nhớ chứa mã nguồn gốc, giúp giảm chi phí sao chép dữ liệu về 0.</w:t>
-      </w:r>
-    </w:p>
-    <w:p>
-      <w:pPr>
-        <w:ind w:left="1440"/>
-      </w:pPr>
-      <w:r>
-        <w:t xml:space="preserve">+ </w:t>
-      </w:r>
-      <w:r>
-        <w:t xml:space="preserve">Hệ thống </w:t>
-      </w:r>
+        <w:t>- Ngữ nghĩa (Semantic Specification):</w:t>
+      </w:r>
+      <w:r>
+        <w:t xml:space="preserve"> Tập trung vào việc kiểm tra kiểu dữ liệu tĩnh (Static Typing) và ràng buộc phạm vi (Scope), đảm bảo tính an toàn trước khi chuyển mã sang LLVM IR.</w:t>
+      </w:r>
+    </w:p>
+    <w:p>
+      <w:pPr>
+        <w:ind w:left="720"/>
+        <w:rPr>
+          <w:lang w:val="en-US"/>
+        </w:rPr>
+      </w:pPr>
       <w:r>
         <w:rPr>
           <w:b/>
           <w:bCs/>
-        </w:rPr>
-        <w:t>"Span"</w:t>
-      </w:r>
-      <w:r>
-        <w:t>: Sử dụng kỹ thuật lưu trữ vị trí dạng byte offset (tương tự Rust) để tối ưu hóa kích thước Token, đảm bảo khả năng mở rộng khi phân tích dự án có hàng chục nghìn file mã nguồn.</w:t>
-      </w:r>
-    </w:p>
-    <w:p>
-      <w:pPr>
-        <w:ind w:left="720"/>
-      </w:pPr>
+          <w:lang w:val="en-US"/>
+        </w:rPr>
+        <w:t>-</w:t>
+      </w:r>
+      <w:r>
+        <w:rPr>
+          <w:lang w:val="en-US"/>
+        </w:rPr>
+        <w:t xml:space="preserve"> </w:t>
+      </w:r>
       <w:r>
         <w:rPr>
           <w:b/>
           <w:bCs/>
-        </w:rPr>
-        <w:lastRenderedPageBreak/>
-        <w:t xml:space="preserve">- </w:t>
+          <w:lang w:val="en-US"/>
+        </w:rPr>
+        <w:t>Cơ chế quản lý bộ nhớ (</w:t>
       </w:r>
       <w:r>
         <w:rPr>
           <w:b/>
           <w:bCs/>
-        </w:rPr>
-        <w:t>Cú pháp (Syntactic Specification):</w:t>
-      </w:r>
-      <w:r>
-        <w:t xml:space="preserve"> Cú pháp của fdlang được thiết kế hướng mục tiêu, hỗ trợ các cấu trúc khai báo biến (dec), điều khiển luồng (if, else) và module hóa (mod, export, extern), đảm bảo tính chặt chẽ và tường minh.</w:t>
-      </w:r>
-    </w:p>
-    <w:p>
-      <w:pPr>
-        <w:ind w:left="720"/>
-      </w:pPr>
+          <w:lang w:val="en-US"/>
+        </w:rPr>
+        <w:t>Ownership, borrowing</w:t>
+      </w:r>
       <w:r>
         <w:rPr>
           <w:b/>
           <w:bCs/>
-        </w:rPr>
-        <w:t xml:space="preserve">- </w:t>
-      </w:r>
+          <w:lang w:val="en-US"/>
+        </w:rPr>
+        <w:t xml:space="preserve">): </w:t>
+      </w:r>
+    </w:p>
+    <w:p>
+      <w:pPr>
+        <w:pStyle w:val="u2"/>
+      </w:pPr>
+      <w:r>
+        <w:t>2.3. Công nghệ/Công cụ sử dụng</w:t>
+      </w:r>
+    </w:p>
+    <w:p>
+      <w:r>
+        <w:t xml:space="preserve"> </w:t>
+      </w:r>
+      <w:r>
+        <w:t>Để đảm bảo mục tiêu hiệu năng và tính bền vững, dự án fdlang được xây dựng dựa trên các công nghệ tiêu chuẩn công nghiệp:</w:t>
+      </w:r>
+    </w:p>
+    <w:p>
+      <w:pPr>
+        <w:ind w:left="720"/>
+      </w:pPr>
       <w:r>
         <w:rPr>
           <w:b/>
           <w:bCs/>
         </w:rPr>
-        <w:t>Ngữ nghĩa (Semantic Specification):</w:t>
-      </w:r>
-      <w:r>
-        <w:t xml:space="preserve"> Tập trung vào việc kiểm tra kiểu dữ liệu tĩnh (Static Typing) và ràng buộc phạm vi (Scope), đảm bảo tính an toàn trước khi chuyển mã sang LLVM IR.</w:t>
-      </w:r>
-    </w:p>
-    <w:p>
-      <w:pPr>
-        <w:pStyle w:val="u2"/>
-      </w:pPr>
-      <w:r>
-        <w:t>2.3. Công nghệ/Công cụ sử dụng</w:t>
-      </w:r>
-    </w:p>
-    <w:p>
-      <w:r>
-        <w:t xml:space="preserve"> </w:t>
-      </w:r>
-      <w:r>
-        <w:t>Để đảm bảo mục tiêu hiệu năng và tính bền vững, dự án fdlang được xây dựng dựa trên các công nghệ tiêu chuẩn công nghiệp:</w:t>
+        <w:t>- Ngôn ngữ lập trình (C++17):</w:t>
+      </w:r>
+      <w:r>
+        <w:t xml:space="preserve"> Lựa chọn tiêu chuẩn C++17 giúp tận dụng tối đa các tính năng lập trình hiện đại như std::string_view, các kiểu dữ liệu an toàn và cơ chế quản lý tài nguyên hiệu quả, phù hợp để xây dựng compiler.</w:t>
       </w:r>
     </w:p>
     <w:p>
@@ -960,17 +932,25 @@
           <w:b/>
           <w:bCs/>
         </w:rPr>
-        <w:t xml:space="preserve">- </w:t>
-      </w:r>
+        <w:t>- Hệ sinh thái LLVM:</w:t>
+      </w:r>
+      <w:r>
+        <w:t xml:space="preserve"> Sử dụng các thư viện cốt lõi của LLVM để xử lý mã trung gian (LLVM IR). Việc tích hợp LLVM cho phép fdlang tập trung hoàn toàn vào việc thiết kế ngôn ngữ mà không cần tốn nguồn lực để tự xây dựng các thuật toán tối ưu hóa mã máy hay hỗ trợ đa kiến trúc phần cứng.</w:t>
+      </w:r>
+    </w:p>
+    <w:p>
+      <w:pPr>
+        <w:ind w:left="720"/>
+      </w:pPr>
       <w:r>
         <w:rPr>
           <w:b/>
           <w:bCs/>
         </w:rPr>
-        <w:t>Ngôn ngữ lập trình (C++17):</w:t>
-      </w:r>
-      <w:r>
-        <w:t xml:space="preserve"> Lựa chọn tiêu chuẩn C++17 giúp tận dụng tối đa các tính năng lập trình hiện đại như std::string_view, các kiểu dữ liệu an toàn và cơ chế quản lý tài nguyên hiệu quả, phù hợp để xây dựng compiler.</w:t>
+        <w:t>- Hệ thống xây dựng (CMake):</w:t>
+      </w:r>
+      <w:r>
+        <w:t xml:space="preserve"> Sử dụng CMake để quản lý cấu trúc dự án phức tạp, hỗ trợ biên dịch đa nền tảng và giải quyết các xung đột thư viện (dependency management), đặc biệt là các cấu hình liên kết (Linker) trên môi trường Windows/MSVC.</w:t>
       </w:r>
     </w:p>
     <w:p>
@@ -982,174 +962,188 @@
           <w:b/>
           <w:bCs/>
         </w:rPr>
-        <w:t xml:space="preserve">- </w:t>
+        <w:t>- Môi trường phát triển:</w:t>
+      </w:r>
+    </w:p>
+    <w:p>
+      <w:pPr>
+        <w:ind w:left="1440"/>
+      </w:pPr>
+      <w:r>
+        <w:t>+ Trình biên dịch: MSVC (Visual Studio Compiler) 18.x.</w:t>
+      </w:r>
+    </w:p>
+    <w:p>
+      <w:pPr>
+        <w:ind w:left="1440"/>
+      </w:pPr>
+      <w:r>
+        <w:t>+ Trình quản lý hệ thống xây dựng: CMake 3.x.</w:t>
+      </w:r>
+    </w:p>
+    <w:p>
+      <w:pPr>
+        <w:ind w:left="1440"/>
+      </w:pPr>
+      <w:r>
+        <w:t>+ Môi trường tích hợp: Visual Studio Code kết hợp các công cụ gỡ lỗi (Debugger) để kiểm soát bộ nhớ và luồng thực thi trong quá trình phát triển Lexer và Parser.</w:t>
+      </w:r>
+    </w:p>
+    <w:p/>
+    <w:p/>
+    <w:p>
+      <w:pPr>
+        <w:jc w:val="left"/>
+      </w:pPr>
+      <w:r>
+        <w:br w:type="page"/>
+      </w:r>
+    </w:p>
+    <w:p>
+      <w:pPr>
+        <w:pStyle w:val="u1"/>
+      </w:pPr>
+      <w:r>
+        <w:lastRenderedPageBreak/>
+        <w:t>CHƯƠNG III THIẾT KẾ, THỰC HIỆN</w:t>
+      </w:r>
+    </w:p>
+    <w:p>
+      <w:pPr>
+        <w:pStyle w:val="u2"/>
+        <w:rPr>
+          <w:lang w:val="en-US"/>
+        </w:rPr>
+      </w:pPr>
+      <w:r>
+        <w:t>3.1. Phân tích từ vựng (Lexical Analysis)</w:t>
+      </w:r>
+    </w:p>
+    <w:p>
+      <w:pPr>
+        <w:ind w:firstLine="720"/>
+      </w:pPr>
+      <w:r>
+        <w:t xml:space="preserve">Phân tích từ vựng là giai đoạn đầu tiên trong quá trình biên dịch của fdlang. Nhiệm vụ cốt lõi là đọc chuỗi mã nguồn thô (source code) và chuyển đổi chúng thành một luồng (stream) các đơn vị từ vựng có ý nghĩa gọi là </w:t>
       </w:r>
       <w:r>
         <w:rPr>
           <w:b/>
           <w:bCs/>
         </w:rPr>
-        <w:t>Hệ sinh thái LLVM:</w:t>
-      </w:r>
-      <w:r>
-        <w:t xml:space="preserve"> Sử dụng các thư viện cốt lõi của LLVM để xử lý mã trung gian (LLVM IR). Việc tích hợp LLVM cho phép fdlang tập trung hoàn toàn vào việc thiết kế ngôn ngữ mà không cần tốn nguồn lực để tự xây dựng các thuật toán tối ưu hóa mã máy hay hỗ trợ đa kiến trúc phần cứng.</w:t>
-      </w:r>
-    </w:p>
-    <w:p>
-      <w:pPr>
-        <w:ind w:left="720"/>
-      </w:pPr>
+        <w:t>Token</w:t>
+      </w:r>
+      <w:r>
+        <w:t>.</w:t>
+      </w:r>
+    </w:p>
+    <w:p>
+      <w:pPr>
+        <w:pStyle w:val="u3"/>
+      </w:pPr>
+      <w:r>
+        <w:t>3.1.1. Kiến trúc Token và kỹ thuật Span</w:t>
+      </w:r>
+    </w:p>
+    <w:p>
+      <w:pPr>
+        <w:ind w:firstLine="720"/>
+      </w:pPr>
+      <w:r>
+        <w:t xml:space="preserve">Để tối ưu hóa hiệu năng và quản lý bộ nhớ, fdlang sử dụng cấu trúc Token "mỏng nhẹ" dựa trên kỹ thuật </w:t>
+      </w:r>
       <w:r>
         <w:rPr>
           <w:b/>
           <w:bCs/>
         </w:rPr>
-        <w:t xml:space="preserve">- </w:t>
-      </w:r>
+        <w:t>Span</w:t>
+      </w:r>
+      <w:r>
+        <w:t xml:space="preserve"> (tương tự rustc):</w:t>
+      </w:r>
+    </w:p>
+    <w:p>
+      <w:pPr>
+        <w:ind w:firstLine="720"/>
+      </w:pPr>
       <w:r>
         <w:rPr>
           <w:b/>
           <w:bCs/>
         </w:rPr>
-        <w:t>Hệ thống xây dựng (CMake):</w:t>
-      </w:r>
-      <w:r>
-        <w:t xml:space="preserve"> Sử dụng CMake để quản lý cấu trúc dự án phức tạp, hỗ trợ biên dịch đa nền tảng và giải quyết các xung đột thư viện (dependency management), đặc biệt là các cấu hình liên kết (Linker) trên môi trường Windows/MSVC.</w:t>
-      </w:r>
-    </w:p>
-    <w:p>
-      <w:pPr>
-        <w:ind w:left="720"/>
+        <w:t>Token</w:t>
+      </w:r>
+      <w:r>
+        <w:t>: Không lưu trữ trực tiếp dữ liệu (như chuỗi std::string), mà chỉ lưu trữ một cấu trúc std::string_view trỏ về vùng nhớ của mã nguồn gốc. Điều này giúp giảm chi phí cấp phát bộ nhớ xuống mức bằng 0 (Zero-allocation).</w:t>
+      </w:r>
+    </w:p>
+    <w:p>
+      <w:pPr>
+        <w:ind w:firstLine="720"/>
       </w:pPr>
       <w:r>
         <w:rPr>
           <w:b/>
           <w:bCs/>
         </w:rPr>
-        <w:t xml:space="preserve">- </w:t>
+        <w:t>Span</w:t>
+      </w:r>
+      <w:r>
+        <w:t>: Mỗi Token chứa một byteOffset – xác định vị trí bắt đầu của Token trong toàn bộ tệp mã nguồn. Việc này giúp fdlang dễ dàng truy xuất thông tin dòng/cột chỉ khi thực sự cần thiết (ví dụ: khi xảy ra lỗi), giúp giảm đáng kể kích thước của mỗi Token trong bộ nhớ.</w:t>
+      </w:r>
+    </w:p>
+    <w:p>
+      <w:pPr>
+        <w:pStyle w:val="u3"/>
+      </w:pPr>
+      <w:r>
+        <w:t>3.1.2. Cơ chế "Pull-based Lexing"</w:t>
+      </w:r>
+    </w:p>
+    <w:p>
+      <w:pPr>
+        <w:ind w:firstLine="720"/>
+      </w:pPr>
+      <w:r>
+        <w:t xml:space="preserve">Lexer của fdlang được thiết kế theo cơ chế </w:t>
       </w:r>
       <w:r>
         <w:rPr>
           <w:b/>
           <w:bCs/>
         </w:rPr>
-        <w:t>Môi trường phát triển:</w:t>
-      </w:r>
-    </w:p>
-    <w:p>
-      <w:pPr>
-        <w:ind w:left="1440"/>
-      </w:pPr>
-      <w:r>
-        <w:t xml:space="preserve">+ </w:t>
-      </w:r>
-      <w:r>
-        <w:t>Trình biên dịch: MSVC (Visual Studio Compiler) 18.x.</w:t>
-      </w:r>
-    </w:p>
-    <w:p>
-      <w:pPr>
-        <w:ind w:left="1440"/>
-      </w:pPr>
-      <w:r>
-        <w:t xml:space="preserve">+ </w:t>
-      </w:r>
-      <w:r>
-        <w:t>Trình quản lý hệ thống xây dựng: CMake 3.x.</w:t>
-      </w:r>
-    </w:p>
-    <w:p>
-      <w:pPr>
-        <w:ind w:left="1440"/>
-      </w:pPr>
-      <w:r>
-        <w:t xml:space="preserve">+ </w:t>
-      </w:r>
-      <w:r>
-        <w:t>Môi trường tích hợp: Visual Studio Code kết hợp các công cụ gỡ lỗi (Debugger) để kiểm soát bộ nhớ và luồng thực thi trong quá trình phát triển Lexer và Parser.</w:t>
-      </w:r>
-    </w:p>
-    <w:p/>
-    <w:p/>
-    <w:p>
-      <w:pPr>
-        <w:jc w:val="left"/>
-      </w:pPr>
-      <w:r>
-        <w:br w:type="page"/>
-      </w:r>
-    </w:p>
-    <w:p>
-      <w:pPr>
-        <w:pStyle w:val="u1"/>
-        <w:rPr>
-          <w:lang w:val="en-US"/>
-        </w:rPr>
-      </w:pPr>
-      <w:r>
-        <w:rPr>
-          <w:lang w:val="en-US"/>
-        </w:rPr>
-        <w:lastRenderedPageBreak/>
-        <w:t>CHƯƠNG III THIẾT KẾ, THỰC HIỆN</w:t>
-      </w:r>
-    </w:p>
-    <w:p>
-      <w:pPr>
-        <w:pStyle w:val="u2"/>
-        <w:rPr>
-          <w:lang w:val="en-US"/>
-        </w:rPr>
-      </w:pPr>
-      <w:r>
-        <w:t>3.1. Phân tích từ vựng (Lexical Analysis)</w:t>
+        <w:t>Pull-based</w:t>
+      </w:r>
+      <w:r>
+        <w:t>. Thay vì quét toàn bộ file và tạo ra một mảng Token khổng lồ, Lexer chỉ phân tích từ vựng khi Parser yêu cầu thông qua hàm nextToken().</w:t>
       </w:r>
     </w:p>
     <w:p>
       <w:pPr>
         <w:ind w:firstLine="720"/>
-        <w:rPr>
-          <w:lang w:val="en-US"/>
-        </w:rPr>
-      </w:pPr>
-      <w:r>
-        <w:t xml:space="preserve">Phân tích từ vựng là giai đoạn đầu tiên trong quá trình biên dịch của fdlang. Nhiệm vụ cốt lõi là đọc chuỗi mã nguồn thô (source code) và chuyển đổi chúng thành một luồng (stream) các đơn vị từ vựng có ý nghĩa gọi là </w:t>
-      </w:r>
+      </w:pPr>
       <w:r>
         <w:rPr>
           <w:b/>
           <w:bCs/>
         </w:rPr>
-        <w:t>Token</w:t>
-      </w:r>
-      <w:r>
-        <w:t>.</w:t>
-      </w:r>
-    </w:p>
-    <w:p>
-      <w:pPr>
-        <w:pStyle w:val="u3"/>
-      </w:pPr>
-      <w:r>
-        <w:t>3.1.1. Kiến trúc Token và kỹ thuật Span</w:t>
+        <w:t>Luồng xử lý:</w:t>
       </w:r>
     </w:p>
     <w:p>
       <w:pPr>
         <w:ind w:firstLine="720"/>
       </w:pPr>
-      <w:r>
-        <w:t xml:space="preserve">Để tối ưu hóa hiệu năng và quản lý bộ nhớ, fdlang sử dụng cấu trúc Token "mỏng nhẹ" dựa trên kỹ thuật </w:t>
-      </w:r>
       <w:r>
         <w:rPr>
           <w:b/>
           <w:bCs/>
         </w:rPr>
-        <w:t>Span</w:t>
-      </w:r>
-      <w:r>
-        <w:t xml:space="preserve"> (tương tự rustc):</w:t>
+        <w:t xml:space="preserve"> + Lọc nhiễu:</w:t>
+      </w:r>
+      <w:r>
+        <w:t xml:space="preserve"> Tự động loại bỏ các khoảng trắng (space, tab, newline) và các chú thích (// comment).</w:t>
       </w:r>
     </w:p>
     <w:p>
@@ -1161,10 +1155,30 @@
           <w:b/>
           <w:bCs/>
         </w:rPr>
-        <w:t>Token</w:t>
-      </w:r>
-      <w:r>
-        <w:t>: Không lưu trữ trực tiếp dữ liệu (như chuỗi std::string), mà chỉ lưu trữ một cấu trúc std::string_view trỏ về vùng nhớ của mã nguồn gốc. Điều này giúp giảm chi phí cấp phát bộ nhớ xuống mức bằng 0 (Zero-allocation).</w:t>
+        <w:t>+ Rẽ nhánh (Router):</w:t>
+      </w:r>
+      <w:r>
+        <w:t xml:space="preserve"> Dựa trên ký tự hiện tại (peek), Lexer sẽ gọi các hàm chuyên biệt:</w:t>
+      </w:r>
+    </w:p>
+    <w:p>
+      <w:r>
+        <w:t>number(): Nếu ký tự đầu là số (0-9).</w:t>
+      </w:r>
+    </w:p>
+    <w:p>
+      <w:r>
+        <w:t>identifierOrKeyword(): Nếu ký tự đầu là chữ cái (a-z, A-Z).</w:t>
+      </w:r>
+    </w:p>
+    <w:p>
+      <w:r>
+        <w:t>string(): Nếu ký tự đầu là dấu ngoặc kép (").</w:t>
+      </w:r>
+    </w:p>
+    <w:p>
+      <w:r>
+        <w:t>Các toán tử/dấu câu: Phân tích theo ký tự đơn hoặc kết hợp (như ==, !=, ::, &lt;=, &gt;=).</w:t>
       </w:r>
     </w:p>
     <w:p>
@@ -1175,124 +1189,6 @@
         <w:rPr>
           <w:b/>
           <w:bCs/>
-        </w:rPr>
-        <w:t>Span</w:t>
-      </w:r>
-      <w:r>
-        <w:t>: Mỗi Token chứa một byteOffset – xác định vị trí bắt đầu của Token trong toàn bộ tệp mã nguồn. Việc này giúp fdlang dễ dàng truy xuất thông tin dòng/cột chỉ khi thực sự cần thiết (ví dụ: khi xảy ra lỗi), giúp giảm đáng kể kích thước của mỗi Token trong bộ nhớ.</w:t>
-      </w:r>
-    </w:p>
-    <w:p>
-      <w:pPr>
-        <w:pStyle w:val="u3"/>
-      </w:pPr>
-      <w:r>
-        <w:t>3.1.2. Cơ chế "Pull-based Lexing"</w:t>
-      </w:r>
-    </w:p>
-    <w:p>
-      <w:pPr>
-        <w:ind w:firstLine="720"/>
-      </w:pPr>
-      <w:r>
-        <w:t xml:space="preserve">Lexer của fdlang được thiết kế theo cơ chế </w:t>
-      </w:r>
-      <w:r>
-        <w:rPr>
-          <w:b/>
-          <w:bCs/>
-        </w:rPr>
-        <w:t>Pull-based</w:t>
-      </w:r>
-      <w:r>
-        <w:t>. Thay vì quét toàn bộ file và tạo ra một mảng Token khổng lồ, Lexer chỉ phân tích từ vựng khi Parser yêu cầu thông qua hàm nextToken().</w:t>
-      </w:r>
-    </w:p>
-    <w:p>
-      <w:pPr>
-        <w:ind w:firstLine="720"/>
-      </w:pPr>
-      <w:r>
-        <w:rPr>
-          <w:b/>
-          <w:bCs/>
-        </w:rPr>
-        <w:t>Luồng xử lý:</w:t>
-      </w:r>
-    </w:p>
-    <w:p>
-      <w:pPr>
-        <w:ind w:firstLine="720"/>
-      </w:pPr>
-      <w:r>
-        <w:rPr>
-          <w:b/>
-          <w:bCs/>
-        </w:rPr>
-        <w:t xml:space="preserve"> + </w:t>
-      </w:r>
-      <w:r>
-        <w:rPr>
-          <w:b/>
-          <w:bCs/>
-        </w:rPr>
-        <w:t>Lọc nhiễu:</w:t>
-      </w:r>
-      <w:r>
-        <w:t xml:space="preserve"> Tự động loại bỏ các khoảng trắng (space, tab, newline) và các chú thích (// comment).</w:t>
-      </w:r>
-    </w:p>
-    <w:p>
-      <w:pPr>
-        <w:ind w:firstLine="720"/>
-      </w:pPr>
-      <w:r>
-        <w:rPr>
-          <w:b/>
-          <w:bCs/>
-        </w:rPr>
-        <w:t xml:space="preserve">+ </w:t>
-      </w:r>
-      <w:r>
-        <w:rPr>
-          <w:b/>
-          <w:bCs/>
-        </w:rPr>
-        <w:t>Rẽ nhánh (Router):</w:t>
-      </w:r>
-      <w:r>
-        <w:t xml:space="preserve"> Dựa trên ký tự hiện tại (peek), Lexer sẽ gọi các hàm chuyên biệt:</w:t>
-      </w:r>
-    </w:p>
-    <w:p>
-      <w:r>
-        <w:t>number(): Nếu ký tự đầu là số (0-9).</w:t>
-      </w:r>
-    </w:p>
-    <w:p>
-      <w:r>
-        <w:t>identifierOrKeyword(): Nếu ký tự đầu là chữ cái (a-z, A-Z).</w:t>
-      </w:r>
-    </w:p>
-    <w:p>
-      <w:r>
-        <w:t>string(): Nếu ký tự đầu là dấu ngoặc kép (").</w:t>
-      </w:r>
-    </w:p>
-    <w:p>
-      <w:r>
-        <w:t>Các toán tử/dấu câu: Phân tích theo ký tự đơn hoặc kết hợp (như ==, !=, ::, &lt;=, &gt;=).</w:t>
-      </w:r>
-    </w:p>
-    <w:p>
-      <w:pPr>
-        <w:ind w:firstLine="720"/>
-      </w:pPr>
-      <w:r>
-        <w:rPr>
-          <w:b/>
-          <w:bCs/>
-          <w:lang w:val="en-US"/>
         </w:rPr>
         <w:t xml:space="preserve">+ </w:t>
       </w:r>
@@ -3176,6 +3072,7 @@
   <w:style w:type="character" w:default="1" w:styleId="Phngmcinhcuaoanvn">
     <w:name w:val="Default Paragraph Font"/>
     <w:uiPriority w:val="1"/>
+    <w:semiHidden/>
     <w:unhideWhenUsed/>
   </w:style>
   <w:style w:type="table" w:default="1" w:styleId="BangThngthng">

</xml_diff>